<commit_message>
docs: 补全 docker-offline 部署安装步骤
补全离线包获取来源、scp 整目录传输、zip 解压、脚本授权
（load-images.sh / gen-selfsigned.sh）、目录内容清单、容器状态查看。
</commit_message>
<xml_diff>
--- a/docs/install/项目部署说明-docker-offline.docx
+++ b/docs/install/项目部署说明-docker-offline.docx
@@ -2106,7 +2106,7 @@
         <w:pStyle w:val="Heading2"/>
       </w:pPr>
       <w:r>
-        <w:t xml:space="preserve">步骤 1：传输离线包</w:t>
+        <w:t xml:space="preserve">步骤 1：获取并传输离线包</w:t>
       </w:r>
     </w:p>
     <w:p>
@@ -2118,7 +2118,20 @@
           <w:sz w:val="21"/>
           <w:szCs w:val="21"/>
         </w:rPr>
-        <w:t xml:space="preserve">将离线包目录（含应用镜像 tar、基础镜像 tar、docker-compose.yml、Caddyfile、.env.example、load-images.sh、证书脚本）整体拷贝到目标机。
+        <w:t xml:space="preserve">离线包来源：GitHub 仓库 Actions 页面下载对应架构的构建产物（meeting-docker-x64-*.zip 或 meeting-docker-arm64-*.zip，产物架构必须与目标机 CPU 一致），或在同架构构建机上执行 npm run pack:docker 自行打包。
+</w:t>
+      </w:r>
+    </w:p>
+    <w:p>
+      <w:pPr>
+        <w:spacing w:after="100" w:before="60" w:line="320"/>
+      </w:pPr>
+      <w:r>
+        <w:rPr>
+          <w:sz w:val="21"/>
+          <w:szCs w:val="21"/>
+        </w:rPr>
+        <w:t xml:space="preserve">传输整个目录到目标机（内网环境可用 U 盘/光盘摆渡）：
 </w:t>
       </w:r>
     </w:p>
@@ -2141,17 +2154,20 @@
           <w:sz w:val="18"/>
           <w:szCs w:val="18"/>
         </w:rPr>
-        <w:t xml:space="preserve">解压：
-</w:t>
-      </w:r>
-      <w:r>
-        <w:rPr>
-          <w:rFonts w:ascii="Consolas" w:cs="Consolas" w:eastAsia="Consolas" w:hAnsi="Consolas"/>
-          <w:sz w:val="18"/>
-          <w:szCs w:val="18"/>
-        </w:rPr>
-        <w:br/>
-        <w:t xml:space="preserve">unzip meeting-docker-xx-xxx-1.zip -d meeting-docker
+        <w:t xml:space="preserve">scp -r dist/docker user@&lt;目标机IP&gt;:/opt/meeting-offline/
+</w:t>
+      </w:r>
+    </w:p>
+    <w:p>
+      <w:pPr>
+        <w:spacing w:after="100" w:before="60" w:line="320"/>
+      </w:pPr>
+      <w:r>
+        <w:rPr>
+          <w:sz w:val="21"/>
+          <w:szCs w:val="21"/>
+        </w:rPr>
+        <w:t xml:space="preserve">注意：请整体拷贝目录（scp -r 或先 tar 打包再传输），不要用通配符逐个拷贝文件，避免遗漏。
 </w:t>
       </w:r>
     </w:p>
@@ -2160,7 +2176,20 @@
         <w:pStyle w:val="Heading2"/>
       </w:pPr>
       <w:r>
-        <w:t xml:space="preserve">步骤 2：加载镜像</w:t>
+        <w:t xml:space="preserve">步骤 2：解压</w:t>
+      </w:r>
+    </w:p>
+    <w:p>
+      <w:pPr>
+        <w:spacing w:after="100" w:before="60" w:line="320"/>
+      </w:pPr>
+      <w:r>
+        <w:rPr>
+          <w:sz w:val="21"/>
+          <w:szCs w:val="21"/>
+        </w:rPr>
+        <w:t xml:space="preserve">在目标机上解压构建产物 zip：
+</w:t>
       </w:r>
     </w:p>
     <w:p>
@@ -2182,7 +2211,7 @@
           <w:sz w:val="18"/>
           <w:szCs w:val="18"/>
         </w:rPr>
-        <w:t xml:space="preserve">cd &lt;离线包目录&gt;
+        <w:t xml:space="preserve">cd /opt/meeting-offline
 </w:t>
       </w:r>
       <w:r>
@@ -2192,7 +2221,7 @@
           <w:szCs w:val="18"/>
         </w:rPr>
         <w:br/>
-        <w:t xml:space="preserve">chmod +x load-images.sh
+        <w:t xml:space="preserve">unzip meeting-docker-*.zip -d meeting-docker
 </w:t>
       </w:r>
       <w:r>
@@ -2202,7 +2231,7 @@
           <w:szCs w:val="18"/>
         </w:rPr>
         <w:br/>
-        <w:t xml:space="preserve">bash load-images.sh
+        <w:t xml:space="preserve">cd meeting-docker
 </w:t>
       </w:r>
     </w:p>
@@ -2211,7 +2240,20 @@
         <w:pStyle w:val="Heading2"/>
       </w:pPr>
       <w:r>
-        <w:t xml:space="preserve">步骤 3：配置环境</w:t>
+        <w:t xml:space="preserve">步骤 3：脚本授权并确认文件完整</w:t>
+      </w:r>
+    </w:p>
+    <w:p>
+      <w:pPr>
+        <w:spacing w:after="100" w:before="60" w:line="320"/>
+      </w:pPr>
+      <w:r>
+        <w:rPr>
+          <w:sz w:val="21"/>
+          <w:szCs w:val="21"/>
+        </w:rPr>
+        <w:t xml:space="preserve">为脚本添加执行权限：
+</w:t>
       </w:r>
     </w:p>
     <w:p>
@@ -2233,7 +2275,7 @@
           <w:sz w:val="18"/>
           <w:szCs w:val="18"/>
         </w:rPr>
-        <w:t xml:space="preserve">cp env.example .env
+        <w:t xml:space="preserve">chmod +x load-images.sh
 </w:t>
       </w:r>
       <w:r>
@@ -2243,7 +2285,7 @@
           <w:szCs w:val="18"/>
         </w:rPr>
         <w:br/>
-        <w:t xml:space="preserve">vi .env
+        <w:t xml:space="preserve">chmod +x deploy/docker/gen-selfsigned.sh
 </w:t>
       </w:r>
     </w:p>
@@ -2256,16 +2298,8 @@
           <w:sz w:val="21"/>
           <w:szCs w:val="21"/>
         </w:rPr>
-        <w:t xml:space="preserve">必改项：MEDIASOUP_ANNOUNCED_IP 设为客户端可达的服务器 IP（切勿填 127.0.0.1）；COMPOSE_PROFILES 选择数据库类型（默认 sqlite 零依赖）；使用 postgres / mysql profile 时必须修改默认数据库密码。
-</w:t>
-      </w:r>
-    </w:p>
-    <w:p>
-      <w:pPr>
-        <w:pStyle w:val="Heading2"/>
-      </w:pPr>
-      <w:r>
-        <w:t xml:space="preserve">步骤 4：生成证书（可选）</w:t>
+        <w:t xml:space="preserve">确认目录内容完整：
+</w:t>
       </w:r>
     </w:p>
     <w:p>
@@ -2287,7 +2321,7 @@
           <w:sz w:val="18"/>
           <w:szCs w:val="18"/>
         </w:rPr>
-        <w:t xml:space="preserve">bash deploy/docker/gen-selfsigned.sh &lt;服务器IP或域名&gt;
+        <w:t xml:space="preserve">ls -la
 </w:t>
       </w:r>
     </w:p>
@@ -2300,7 +2334,7 @@
           <w:sz w:val="21"/>
           <w:szCs w:val="21"/>
         </w:rPr>
-        <w:t xml:space="preserve">信创环境请使用 --ca 参数以 CA 签发模式生成根证书与服务器证书，并将 ca.crt 导入客户端浏览器/系统信任机构。
+        <w:t xml:space="preserve">应包含：meeting-app-*.tar（应用镜像）、meeting-base-*.tar（基础镜像）、docker-compose.yml、Caddyfile、env.example（环境配置模板）、load-images.sh（镜像加载脚本）、deploy/docker/gen-selfsigned.sh（证书生成脚本）。
 </w:t>
       </w:r>
     </w:p>
@@ -2309,7 +2343,7 @@
         <w:pStyle w:val="Heading2"/>
       </w:pPr>
       <w:r>
-        <w:t xml:space="preserve">步骤 5：启动与验证</w:t>
+        <w:t xml:space="preserve">步骤 4：加载镜像</w:t>
       </w:r>
     </w:p>
     <w:p>
@@ -2331,7 +2365,7 @@
           <w:sz w:val="18"/>
           <w:szCs w:val="18"/>
         </w:rPr>
-        <w:t xml:space="preserve">docker-compose up -d
+        <w:t xml:space="preserve">bash load-images.sh
 </w:t>
       </w:r>
     </w:p>
@@ -2344,7 +2378,185 @@
           <w:sz w:val="21"/>
           <w:szCs w:val="21"/>
         </w:rPr>
-        <w:t xml:space="preserve">首次启动时 api 容器自动执行数据库迁移并写入默认账号。浏览器打开 https://&lt;服务器IP&gt;/，或执行健康检查：
+        <w:t xml:space="preserve">脚本自动加载目录内全部镜像 tar（应用镜像与 PostgreSQL/MySQL/Redis/Caddy 基础镜像）。加载完成可执行 docker images 确认。
+</w:t>
+      </w:r>
+    </w:p>
+    <w:p>
+      <w:pPr>
+        <w:pStyle w:val="Heading2"/>
+      </w:pPr>
+      <w:r>
+        <w:t xml:space="preserve">步骤 5：配置环境</w:t>
+      </w:r>
+    </w:p>
+    <w:p>
+      <w:pPr>
+        <w:pBdr>
+          <w:top w:val="single" w:color="D9D9D9" w:sz="2"/>
+          <w:bottom w:val="single" w:color="D9D9D9" w:sz="2"/>
+          <w:left w:val="single" w:color="D9D9D9" w:sz="2"/>
+          <w:right w:val="single" w:color="D9D9D9" w:sz="2"/>
+        </w:pBdr>
+        <w:shd w:fill="F5F6F8"/>
+        <w:spacing w:after="160" w:before="120" w:line="300"/>
+        <w:ind w:left="240" w:right="240"/>
+        <w:jc w:val="left"/>
+      </w:pPr>
+      <w:r>
+        <w:rPr>
+          <w:rFonts w:ascii="Consolas" w:cs="Consolas" w:eastAsia="Consolas" w:hAnsi="Consolas"/>
+          <w:sz w:val="18"/>
+          <w:szCs w:val="18"/>
+        </w:rPr>
+        <w:t xml:space="preserve">cp env.example .env
+</w:t>
+      </w:r>
+      <w:r>
+        <w:rPr>
+          <w:rFonts w:ascii="Consolas" w:cs="Consolas" w:eastAsia="Consolas" w:hAnsi="Consolas"/>
+          <w:sz w:val="18"/>
+          <w:szCs w:val="18"/>
+        </w:rPr>
+        <w:br/>
+        <w:t xml:space="preserve">vi .env
+</w:t>
+      </w:r>
+    </w:p>
+    <w:p>
+      <w:pPr>
+        <w:spacing w:after="100" w:before="60" w:line="320"/>
+      </w:pPr>
+      <w:r>
+        <w:rPr>
+          <w:sz w:val="21"/>
+          <w:szCs w:val="21"/>
+        </w:rPr>
+        <w:t xml:space="preserve">必改项：MEDIASOUP_ANNOUNCED_IP 设为客户端可达的服务器 IP（切勿填 127.0.0.1）；COMPOSE_PROFILES 选择数据库类型（默认 sqlite 零依赖）；使用 postgres / mysql profile 时必须修改默认数据库密码。
+</w:t>
+      </w:r>
+    </w:p>
+    <w:p>
+      <w:pPr>
+        <w:pStyle w:val="Heading2"/>
+      </w:pPr>
+      <w:r>
+        <w:t xml:space="preserve">步骤 6：生成证书（可选）</w:t>
+      </w:r>
+    </w:p>
+    <w:p>
+      <w:pPr>
+        <w:pBdr>
+          <w:top w:val="single" w:color="D9D9D9" w:sz="2"/>
+          <w:bottom w:val="single" w:color="D9D9D9" w:sz="2"/>
+          <w:left w:val="single" w:color="D9D9D9" w:sz="2"/>
+          <w:right w:val="single" w:color="D9D9D9" w:sz="2"/>
+        </w:pBdr>
+        <w:shd w:fill="F5F6F8"/>
+        <w:spacing w:after="160" w:before="120" w:line="300"/>
+        <w:ind w:left="240" w:right="240"/>
+        <w:jc w:val="left"/>
+      </w:pPr>
+      <w:r>
+        <w:rPr>
+          <w:rFonts w:ascii="Consolas" w:cs="Consolas" w:eastAsia="Consolas" w:hAnsi="Consolas"/>
+          <w:sz w:val="18"/>
+          <w:szCs w:val="18"/>
+        </w:rPr>
+        <w:t xml:space="preserve">bash deploy/docker/gen-selfsigned.sh &lt;服务器IP或域名&gt;
+</w:t>
+      </w:r>
+    </w:p>
+    <w:p>
+      <w:pPr>
+        <w:spacing w:after="100" w:before="60" w:line="320"/>
+      </w:pPr>
+      <w:r>
+        <w:rPr>
+          <w:sz w:val="21"/>
+          <w:szCs w:val="21"/>
+        </w:rPr>
+        <w:t xml:space="preserve">信创环境请使用 --ca 参数以 CA 签发模式生成根证书与服务器证书，并将 ca.crt 导入客户端浏览器/系统信任机构。
+</w:t>
+      </w:r>
+    </w:p>
+    <w:p>
+      <w:pPr>
+        <w:pStyle w:val="Heading2"/>
+      </w:pPr>
+      <w:r>
+        <w:t xml:space="preserve">步骤 7：启动与验证</w:t>
+      </w:r>
+    </w:p>
+    <w:p>
+      <w:pPr>
+        <w:pBdr>
+          <w:top w:val="single" w:color="D9D9D9" w:sz="2"/>
+          <w:bottom w:val="single" w:color="D9D9D9" w:sz="2"/>
+          <w:left w:val="single" w:color="D9D9D9" w:sz="2"/>
+          <w:right w:val="single" w:color="D9D9D9" w:sz="2"/>
+        </w:pBdr>
+        <w:shd w:fill="F5F6F8"/>
+        <w:spacing w:after="160" w:before="120" w:line="300"/>
+        <w:ind w:left="240" w:right="240"/>
+        <w:jc w:val="left"/>
+      </w:pPr>
+      <w:r>
+        <w:rPr>
+          <w:rFonts w:ascii="Consolas" w:cs="Consolas" w:eastAsia="Consolas" w:hAnsi="Consolas"/>
+          <w:sz w:val="18"/>
+          <w:szCs w:val="18"/>
+        </w:rPr>
+        <w:t xml:space="preserve">docker-compose up -d
+</w:t>
+      </w:r>
+    </w:p>
+    <w:p>
+      <w:pPr>
+        <w:spacing w:after="100" w:before="60" w:line="320"/>
+      </w:pPr>
+      <w:r>
+        <w:rPr>
+          <w:sz w:val="21"/>
+          <w:szCs w:val="21"/>
+        </w:rPr>
+        <w:t xml:space="preserve">首次启动时 api 容器自动执行数据库迁移并写入默认账号。查看容器运行状态：
+</w:t>
+      </w:r>
+    </w:p>
+    <w:p>
+      <w:pPr>
+        <w:pBdr>
+          <w:top w:val="single" w:color="D9D9D9" w:sz="2"/>
+          <w:bottom w:val="single" w:color="D9D9D9" w:sz="2"/>
+          <w:left w:val="single" w:color="D9D9D9" w:sz="2"/>
+          <w:right w:val="single" w:color="D9D9D9" w:sz="2"/>
+        </w:pBdr>
+        <w:shd w:fill="F5F6F8"/>
+        <w:spacing w:after="160" w:before="120" w:line="300"/>
+        <w:ind w:left="240" w:right="240"/>
+        <w:jc w:val="left"/>
+      </w:pPr>
+      <w:r>
+        <w:rPr>
+          <w:rFonts w:ascii="Consolas" w:cs="Consolas" w:eastAsia="Consolas" w:hAnsi="Consolas"/>
+          <w:sz w:val="18"/>
+          <w:szCs w:val="18"/>
+        </w:rPr>
+        <w:t xml:space="preserve">docker-compose ps
+</w:t>
+      </w:r>
+    </w:p>
+    <w:p>
+      <w:pPr>
+        <w:spacing w:after="100" w:before="60" w:line="320"/>
+      </w:pPr>
+      <w:r>
+        <w:rPr>
+          <w:sz w:val="21"/>
+          <w:szCs w:val="21"/>
+        </w:rPr>
+        <w:t xml:space="preserve">浏览器打开 https://&lt;服务器IP&gt;/，或执行健康检查：
 </w:t>
       </w:r>
     </w:p>

</xml_diff>

<commit_message>
docs: docker-offline 部署说明补充 v0.0.10 镜像 retag 应急步骤
- 加载镜像后补充 docker tag 应急命令（v0.0.10 产物镜像 tag 为版本号，
  需 retag 为 latest 才能 compose 匹配；下版本产物已内置双 tag 可跳过）
- 证书步骤改为信创推荐 --ca 模式
- 必改项逐条加粗突出
</commit_message>
<xml_diff>
--- a/docs/install/项目部署说明-docker-offline.docx
+++ b/docs/install/项目部署说明-docker-offline.docx
@@ -2409,7 +2409,7 @@
           <w:sz w:val="18"/>
           <w:szCs w:val="18"/>
         </w:rPr>
-        <w:t xml:space="preserve">cp env.example .env
+        <w:t xml:space="preserve">cp .env.example .env
 </w:t>
       </w:r>
       <w:r>
@@ -2432,7 +2432,46 @@
           <w:sz w:val="21"/>
           <w:szCs w:val="21"/>
         </w:rPr>
-        <w:t xml:space="preserve">必改项：MEDIASOUP_ANNOUNCED_IP 设为客户端可达的服务器 IP（切勿填 127.0.0.1）；COMPOSE_PROFILES 选择数据库类型（默认 sqlite 零依赖）；使用 postgres / mysql profile 时必须修改默认数据库密码。
+        <w:t xml:space="preserve">必改项：
+</w:t>
+      </w:r>
+    </w:p>
+    <w:p>
+      <w:pPr>
+        <w:spacing w:after="100" w:before="60" w:line="320"/>
+      </w:pPr>
+      <w:r>
+        <w:rPr>
+          <w:sz w:val="21"/>
+          <w:szCs w:val="21"/>
+        </w:rPr>
+        <w:t xml:space="preserve">MEDIASOUP_ANNOUNCED_IP 设为客户端可达的服务器 IP（切勿填 127.0.0.1）；
+</w:t>
+      </w:r>
+    </w:p>
+    <w:p>
+      <w:pPr>
+        <w:spacing w:after="100" w:before="60" w:line="320"/>
+      </w:pPr>
+      <w:r>
+        <w:rPr>
+          <w:sz w:val="21"/>
+          <w:szCs w:val="21"/>
+        </w:rPr>
+        <w:t xml:space="preserve">COMPOSE_PROFILES 选择数据库类型（默认 sqlite 零依赖）；
+</w:t>
+      </w:r>
+    </w:p>
+    <w:p>
+      <w:pPr>
+        <w:spacing w:after="100" w:before="60" w:line="320"/>
+      </w:pPr>
+      <w:r>
+        <w:rPr>
+          <w:sz w:val="21"/>
+          <w:szCs w:val="21"/>
+        </w:rPr>
+        <w:t xml:space="preserve">PS: 使用 postgres / mysql profile 时必须修改默认数据库密码。
 </w:t>
       </w:r>
     </w:p>
@@ -2463,7 +2502,7 @@
           <w:sz w:val="18"/>
           <w:szCs w:val="18"/>
         </w:rPr>
-        <w:t xml:space="preserve">bash deploy/docker/gen-selfsigned.sh &lt;服务器IP或域名&gt;
+        <w:t xml:space="preserve">bash deploy/docker/gen-selfsigned.sh --ca &lt;服务器IP或域名&gt;
 </w:t>
       </w:r>
     </w:p>
@@ -2507,6 +2546,66 @@
           <w:sz w:val="18"/>
           <w:szCs w:val="18"/>
         </w:rPr>
+        <w:t xml:space="preserve">docker images | grep meeting   # 确认实际 tag（应为 0.0.10）
+</w:t>
+      </w:r>
+      <w:r>
+        <w:rPr>
+          <w:rFonts w:ascii="Consolas" w:cs="Consolas" w:eastAsia="Consolas" w:hAnsi="Consolas"/>
+          <w:sz w:val="18"/>
+          <w:szCs w:val="18"/>
+        </w:rPr>
+        <w:br/>
+        <w:t xml:space="preserve">
+</w:t>
+      </w:r>
+      <w:r>
+        <w:rPr>
+          <w:rFonts w:ascii="Consolas" w:cs="Consolas" w:eastAsia="Consolas" w:hAnsi="Consolas"/>
+          <w:sz w:val="18"/>
+          <w:szCs w:val="18"/>
+        </w:rPr>
+        <w:br/>
+        <w:t xml:space="preserve">docker tag meeting-api:0.0.10 meeting-api:latest
+</w:t>
+      </w:r>
+      <w:r>
+        <w:rPr>
+          <w:rFonts w:ascii="Consolas" w:cs="Consolas" w:eastAsia="Consolas" w:hAnsi="Consolas"/>
+          <w:sz w:val="18"/>
+          <w:szCs w:val="18"/>
+        </w:rPr>
+        <w:br/>
+        <w:t xml:space="preserve">docker tag meeting-realtime:0.0.10 meeting-realtime:latest
+</w:t>
+      </w:r>
+      <w:r>
+        <w:rPr>
+          <w:rFonts w:ascii="Consolas" w:cs="Consolas" w:eastAsia="Consolas" w:hAnsi="Consolas"/>
+          <w:sz w:val="18"/>
+          <w:szCs w:val="18"/>
+        </w:rPr>
+        <w:br/>
+        <w:t xml:space="preserve">docker tag meeting-web:0.0.10 meeting-web:latest
+</w:t>
+      </w:r>
+      <w:r>
+        <w:rPr>
+          <w:rFonts w:ascii="Consolas" w:cs="Consolas" w:eastAsia="Consolas" w:hAnsi="Consolas"/>
+          <w:sz w:val="18"/>
+          <w:szCs w:val="18"/>
+        </w:rPr>
+        <w:br/>
+        <w:t xml:space="preserve">
+</w:t>
+      </w:r>
+      <w:r>
+        <w:rPr>
+          <w:rFonts w:ascii="Consolas" w:cs="Consolas" w:eastAsia="Consolas" w:hAnsi="Consolas"/>
+          <w:sz w:val="18"/>
+          <w:szCs w:val="18"/>
+        </w:rPr>
+        <w:br/>
         <w:t xml:space="preserve">docker-compose up -d
 </w:t>
       </w:r>
@@ -2580,6 +2679,42 @@
           <w:szCs w:val="18"/>
         </w:rPr>
         <w:t xml:space="preserve">curl -k https://127.0.0.1/api/healthz
+</w:t>
+      </w:r>
+    </w:p>
+    <w:p>
+      <w:pPr>
+        <w:spacing w:after="100" w:before="60" w:line="320"/>
+      </w:pPr>
+      <w:r>
+        <w:rPr>
+          <w:sz w:val="21"/>
+          <w:szCs w:val="21"/>
+        </w:rPr>
+        <w:t xml:space="preserve">下载CA文件
+</w:t>
+      </w:r>
+    </w:p>
+    <w:p>
+      <w:pPr>
+        <w:pBdr>
+          <w:top w:val="single" w:color="D9D9D9" w:sz="2"/>
+          <w:bottom w:val="single" w:color="D9D9D9" w:sz="2"/>
+          <w:left w:val="single" w:color="D9D9D9" w:sz="2"/>
+          <w:right w:val="single" w:color="D9D9D9" w:sz="2"/>
+        </w:pBdr>
+        <w:shd w:fill="F5F6F8"/>
+        <w:spacing w:after="160" w:before="120" w:line="300"/>
+        <w:ind w:left="240" w:right="240"/>
+        <w:jc w:val="left"/>
+      </w:pPr>
+      <w:r>
+        <w:rPr>
+          <w:rFonts w:ascii="Consolas" w:cs="Consolas" w:eastAsia="Consolas" w:hAnsi="Consolas"/>
+          <w:sz w:val="18"/>
+          <w:szCs w:val="18"/>
+        </w:rPr>
+        <w:t xml:space="preserve">安装目录deploy/docker/certs/ca.crt
 </w:t>
       </w:r>
     </w:p>

</xml_diff>